<commit_message>
Improve ALEX v0.3 parsing, Copilot brief workflow, and review UI.
Add Excel gate-spine AST, condition-tree OR/AND fixes, diagram semantics UI fix, evidence chips, brief readiness and knowledge validation gates, M365 docs, GPT_GenLogic golden fixture, team auth, and 250+ tests. Update README and stop tracking local web_data/library.yaml.

Co-authored-by: Cursor <cursoragent@cursor.com>
</commit_message>
<xml_diff>
--- a/pm_sample_inputs/input/edited_Shutoff_Condition_Spec.docx
+++ b/pm_sample_inputs/input/edited_Shutoff_Condition_Spec.docx
@@ -168,7 +168,7 @@
         </w:trPr>
         <w:tc>
           <w:tcPr>
-            <w:tcW w:w="2100" w:type="dxa"/>
+            <w:tcW w:w="2250" w:type="dxa"/>
             <w:tcBorders>
               <w:top w:val="single" w:sz="6" w:space="0" w:color="000000"/>
               <w:left w:val="single" w:sz="6" w:space="0" w:color="000000"/>
@@ -239,7 +239,7 @@
         </w:trPr>
         <w:tc>
           <w:tcPr>
-            <w:tcW w:w="2100" w:type="dxa"/>
+            <w:tcW w:w="2250" w:type="dxa"/>
             <w:vMerge w:val="restart"/>
             <w:tcBorders>
               <w:top w:val="single" w:sz="6" w:space="0" w:color="000000"/>
@@ -251,6 +251,7 @@
             <w:pPr>
               <w:rPr>
                 <w:rFonts w:ascii="Times New Roman" w:hAnsi="Times New Roman" w:cs="Times New Roman"/>
+                <w:b/>
                 <w:sz w:val="20"/>
                 <w:szCs w:val="20"/>
               </w:rPr>
@@ -298,6 +299,81 @@
         </w:tc>
         <w:tc>
           <w:tcPr>
+            <w:tcW w:w="7174" w:type="dxa"/>
+            <w:gridSpan w:val="2"/>
+            <w:tcBorders>
+              <w:top w:val="single" w:sz="4" w:space="0" w:color="auto"/>
+              <w:left w:val="single" w:sz="4" w:space="0" w:color="auto"/>
+              <w:right w:val="single" w:sz="4" w:space="0" w:color="auto"/>
+            </w:tcBorders>
+          </w:tcPr>
+          <w:p>
+            <w:pPr>
+              <w:rPr>
+                <w:rFonts w:ascii="Times New Roman" w:eastAsia="Consolas" w:hAnsi="Times New Roman" w:cs="Times New Roman"/>
+                <w:sz w:val="20"/>
+                <w:szCs w:val="20"/>
+                <w:lang w:val="vi-VN"/>
+              </w:rPr>
+            </w:pPr>
+            <w:r>
+              <w:rPr>
+                <w:rFonts w:ascii="Times New Roman" w:eastAsia="Consolas" w:hAnsi="Times New Roman" w:cs="Times New Roman"/>
+                <w:sz w:val="20"/>
+                <w:szCs w:val="20"/>
+                <w:lang w:val="vi-VN"/>
+              </w:rPr>
+              <w:t>HUY = OK</w:t>
+            </w:r>
+          </w:p>
+        </w:tc>
+      </w:tr>
+      <w:tr>
+        <w:trPr>
+          <w:trHeight w:val="174"/>
+          <w:jc w:val="center"/>
+        </w:trPr>
+        <w:tc>
+          <w:tcPr>
+            <w:tcW w:w="2250" w:type="dxa"/>
+            <w:vMerge/>
+            <w:tcBorders>
+              <w:left w:val="single" w:sz="6" w:space="0" w:color="000000"/>
+              <w:right w:val="single" w:sz="4" w:space="0" w:color="auto"/>
+            </w:tcBorders>
+          </w:tcPr>
+          <w:p>
+            <w:pPr>
+              <w:rPr>
+                <w:rFonts w:ascii="Times New Roman" w:hAnsi="Times New Roman" w:cs="Times New Roman"/>
+                <w:sz w:val="20"/>
+                <w:szCs w:val="20"/>
+              </w:rPr>
+            </w:pPr>
+          </w:p>
+        </w:tc>
+        <w:tc>
+          <w:tcPr>
+            <w:tcW w:w="501" w:type="dxa"/>
+            <w:vMerge/>
+            <w:tcBorders>
+              <w:left w:val="single" w:sz="4" w:space="0" w:color="auto"/>
+              <w:right w:val="single" w:sz="4" w:space="0" w:color="auto"/>
+            </w:tcBorders>
+          </w:tcPr>
+          <w:p>
+            <w:pPr>
+              <w:rPr>
+                <w:rFonts w:ascii="Times New Roman" w:hAnsi="Times New Roman" w:cs="Times New Roman"/>
+                <w:sz w:val="20"/>
+                <w:szCs w:val="20"/>
+                <w:lang w:val="vi-VN"/>
+              </w:rPr>
+            </w:pPr>
+          </w:p>
+        </w:tc>
+        <w:tc>
+          <w:tcPr>
             <w:tcW w:w="954" w:type="dxa"/>
             <w:vMerge w:val="restart"/>
             <w:tcBorders>
@@ -372,7 +448,7 @@
         </w:trPr>
         <w:tc>
           <w:tcPr>
-            <w:tcW w:w="2100" w:type="dxa"/>
+            <w:tcW w:w="2250" w:type="dxa"/>
             <w:vMerge/>
             <w:tcBorders>
               <w:left w:val="single" w:sz="6" w:space="0" w:color="000000"/>
@@ -463,16 +539,7 @@
                 <w:szCs w:val="20"/>
                 <w:lang w:val="vi-VN"/>
               </w:rPr>
-              <w:t xml:space="preserve"> = </w:t>
-            </w:r>
-            <w:r>
-              <w:rPr>
-                <w:rFonts w:ascii="Times New Roman" w:eastAsia="Consolas" w:hAnsi="Times New Roman" w:cs="Times New Roman"/>
-                <w:sz w:val="20"/>
-                <w:szCs w:val="20"/>
-                <w:lang w:val="vi-VN"/>
-              </w:rPr>
-              <w:t>(*1)</w:t>
+              <w:t xml:space="preserve"> = (*1)</w:t>
             </w:r>
           </w:p>
         </w:tc>
@@ -484,7 +551,7 @@
         </w:trPr>
         <w:tc>
           <w:tcPr>
-            <w:tcW w:w="2100" w:type="dxa"/>
+            <w:tcW w:w="2250" w:type="dxa"/>
             <w:vMerge/>
             <w:tcBorders>
               <w:left w:val="single" w:sz="6" w:space="0" w:color="000000"/>
@@ -597,7 +664,7 @@
         </w:trPr>
         <w:tc>
           <w:tcPr>
-            <w:tcW w:w="2100" w:type="dxa"/>
+            <w:tcW w:w="2250" w:type="dxa"/>
             <w:vMerge/>
             <w:tcBorders>
               <w:left w:val="single" w:sz="6" w:space="0" w:color="000000"/>
@@ -974,16 +1041,7 @@
                 <w:szCs w:val="20"/>
                 <w:lang w:val="vi-VN"/>
               </w:rPr>
-              <w:t xml:space="preserve"> </w:t>
-            </w:r>
-            <w:r>
-              <w:rPr>
-                <w:rFonts w:ascii="Times New Roman" w:eastAsia="Consolas" w:hAnsi="Times New Roman" w:cs="Times New Roman"/>
-                <w:sz w:val="20"/>
-                <w:szCs w:val="20"/>
-                <w:lang w:val="vi-VN"/>
-              </w:rPr>
-              <w:t>= 1</w:t>
+              <w:t xml:space="preserve"> = 1</w:t>
             </w:r>
           </w:p>
         </w:tc>
@@ -1070,16 +1128,7 @@
                 <w:szCs w:val="20"/>
                 <w:lang w:val="vi-VN"/>
               </w:rPr>
-              <w:t xml:space="preserve"> </w:t>
-            </w:r>
-            <w:r>
-              <w:rPr>
-                <w:rFonts w:ascii="Times New Roman" w:eastAsia="Consolas" w:hAnsi="Times New Roman" w:cs="Times New Roman"/>
-                <w:sz w:val="20"/>
-                <w:szCs w:val="20"/>
-                <w:lang w:val="vi-VN"/>
-              </w:rPr>
-              <w:t>= 1</w:t>
+              <w:t xml:space="preserve"> = 1</w:t>
             </w:r>
           </w:p>
         </w:tc>
@@ -1197,16 +1246,7 @@
                 <w:szCs w:val="20"/>
                 <w:lang w:val="vi-VN"/>
               </w:rPr>
-              <w:t xml:space="preserve"> </w:t>
-            </w:r>
-            <w:r>
-              <w:rPr>
-                <w:rFonts w:ascii="Times New Roman" w:eastAsia="Consolas" w:hAnsi="Times New Roman" w:cs="Times New Roman"/>
-                <w:sz w:val="20"/>
-                <w:szCs w:val="20"/>
-                <w:lang w:val="vi-VN"/>
-              </w:rPr>
-              <w:t>= 1</w:t>
+              <w:t xml:space="preserve"> = 1</w:t>
             </w:r>
           </w:p>
         </w:tc>
@@ -1344,16 +1384,7 @@
                 <w:szCs w:val="20"/>
                 <w:lang w:val="vi-VN"/>
               </w:rPr>
-              <w:t xml:space="preserve"> </w:t>
-            </w:r>
-            <w:r>
-              <w:rPr>
-                <w:rFonts w:ascii="Times New Roman" w:eastAsia="Consolas" w:hAnsi="Times New Roman" w:cs="Times New Roman"/>
-                <w:sz w:val="20"/>
-                <w:szCs w:val="20"/>
-                <w:lang w:val="vi-VN"/>
-              </w:rPr>
-              <w:t>= 1</w:t>
+              <w:t xml:space="preserve"> = 1</w:t>
             </w:r>
           </w:p>
         </w:tc>
@@ -1450,16 +1481,7 @@
                 <w:szCs w:val="20"/>
                 <w:lang w:val="vi-VN"/>
               </w:rPr>
-              <w:t xml:space="preserve"> </w:t>
-            </w:r>
-            <w:r>
-              <w:rPr>
-                <w:rFonts w:ascii="Times New Roman" w:eastAsia="Consolas" w:hAnsi="Times New Roman" w:cs="Times New Roman"/>
-                <w:sz w:val="20"/>
-                <w:szCs w:val="20"/>
-                <w:lang w:val="vi-VN"/>
-              </w:rPr>
-              <w:t>= 2</w:t>
+              <w:t xml:space="preserve"> = 2</w:t>
             </w:r>
           </w:p>
         </w:tc>
@@ -1634,16 +1656,7 @@
                 <w:szCs w:val="20"/>
                 <w:lang w:val="vi-VN"/>
               </w:rPr>
-              <w:t xml:space="preserve"> </w:t>
-            </w:r>
-            <w:r>
-              <w:rPr>
-                <w:rFonts w:ascii="Times New Roman" w:eastAsia="Consolas" w:hAnsi="Times New Roman" w:cs="Times New Roman"/>
-                <w:sz w:val="20"/>
-                <w:szCs w:val="20"/>
-                <w:lang w:val="vi-VN"/>
-              </w:rPr>
-              <w:t>= 2</w:t>
+              <w:t xml:space="preserve"> = 2</w:t>
             </w:r>
           </w:p>
         </w:tc>
@@ -3091,7 +3104,6 @@
           <w:szCs w:val="20"/>
           <w:lang w:val="vi-VN"/>
         </w:rPr>
-        <w:lastRenderedPageBreak/>
         <w:t>Refer definitions:</w:t>
       </w:r>
     </w:p>

</xml_diff>